<commit_message>
EngageWell: remove fundraising figures; record no-fundraising-numbers preference in master list
Co-Authored-By: Claude Opus 5.5 <noreply@anthropic.com>
Claude-Session: https://claude.ai/code/session_01Rb4ZTXZXZvRymPmEXq9dPj
</commit_message>
<xml_diff>
--- a/resumes/Clavel_Lazarre_Resume_EngageWell_ED.docx
+++ b/resumes/Clavel_Lazarre_Resume_EngageWell_ED.docx
@@ -93,7 +93,7 @@
           <w:color w:val="222222"/>
           <w:sz w:val="21"/>
         </w:rPr>
-        <w:t>Mission-driven finance and operations executive with 20+ years of experience growing revenue, managing healthcare and nonprofit finances, and building organizations that serve marginalized communities. Brings hands-on experience with IPA-related finances and Medicaid managed care billing, substance use and reentry programs, Form 990 and audit oversight, and government contracts. An entrepreneurial builder who partners with boards, runs day-to-day finance and administration in lean organizations, and translates relationships into sustainable funding.</w:t>
+        <w:t>Mission-driven finance and operations executive with 20+ years of experience growing revenue, managing healthcare and nonprofit finances, and building organizations that serve marginalized communities. Brings hands-on experience with IPA-related finances and Medicaid managed care billing, substance use and reentry programs, Form 990 and audit oversight, and government contracts, along with a long track record of fundraising from donors, foundations, and corporate partners. An entrepreneurial builder who partners with boards, runs day-to-day finance and administration in lean organizations, and translates relationships into sustainable funding.</w:t>
       </w:r>
     </w:p>
     <w:p>
@@ -586,7 +586,7 @@
           <w:color w:val="222222"/>
           <w:sz w:val="21"/>
         </w:rPr>
-        <w:t>Led fundraising for the division: identified and prioritized prospects, developed proposals, and personally led solicitation of the highest-value donors, foundations, and corporate partners, raising $400K+ from funders and partners including REDF and JC Flowers.</w:t>
+        <w:t>Led fundraising for the division: identified and prioritized prospects, developed proposals, and personally led solicitation of the highest-value donors, foundations, and corporate partners, including funders and partners REDF and JC Flowers.</w:t>
       </w:r>
     </w:p>
     <w:p>

</xml_diff>